<commit_message>
Site PréProd « RH Power Apps Données PréProd » et réponse sur le site de données Prod
Co-Authored-By: Claude Opus 5.5 <noreply@anthropic.com>
Claude-Session: https://claude.ai/code/session_01FRdAzq8p3F9gJJe5MA3G79
</commit_message>
<xml_diff>
--- a/powerapps/documents-TI/APCONT_Architecture-application.docx
+++ b/powerapps/documents-TI/APCONT_Architecture-application.docx
@@ -1670,26 +1670,48 @@
             </w:pPr>
             <w:r>
               <w:rPr>
-                <w:iCs/>
-                <w:i/>
+                <w:bCs/>
+                <w:b/>
               </w:rPr>
-              <w:t xml:space="preserve">[adresse du site PréProd]</w:t>
-            </w:r>
-          </w:p>
-        </w:tc>
-        <w:tc>
-          <w:tcPr/>
-          <w:p>
-            <w:pPr>
-              <w:pStyle w:val="Compact"/>
-              <w:jc w:val="left"/>
-            </w:pPr>
+              <w:t xml:space="preserve">RH Power Apps Données PréProd</w:t>
+            </w:r>
+            <w:r>
+              <w:t xml:space="preserve"> </w:t>
+            </w:r>
+            <w:r>
+              <w:t xml:space="preserve">(</w:t>
+            </w:r>
             <w:r>
               <w:rPr>
                 <w:iCs/>
                 <w:i/>
               </w:rPr>
-              <w:t xml:space="preserve">[adresse du site Prod]</w:t>
+              <w:t xml:space="preserve">[adresse URL]</w:t>
+            </w:r>
+            <w:r>
+              <w:t xml:space="preserve">)</w:t>
+            </w:r>
+          </w:p>
+        </w:tc>
+        <w:tc>
+          <w:tcPr/>
+          <w:p>
+            <w:pPr>
+              <w:pStyle w:val="Compact"/>
+              <w:jc w:val="left"/>
+            </w:pPr>
+            <w:r>
+              <w:t xml:space="preserve">site de données Prod des TI (</w:t>
+            </w:r>
+            <w:r>
+              <w:rPr>
+                <w:iCs/>
+                <w:i/>
+              </w:rPr>
+              <w:t xml:space="preserve">[nom et adresse à confirmer, ex. « RH Power Apps Données Prod »]</w:t>
+            </w:r>
+            <w:r>
+              <w:t xml:space="preserve">)</w:t>
             </w:r>
           </w:p>
         </w:tc>

</xml_diff>